<commit_message>
docs(review): sync planning markdown source with revised docx
</commit_message>
<xml_diff>
--- a/docs/assessments/nstc-meeting-program-planning.docx
+++ b/docs/assessments/nstc-meeting-program-planning.docx
@@ -3175,7 +3175,7 @@
           <w:color w:val="1A1A1A"/>
           <w:lang w:eastAsia="zh-TW"/>
         </w:rPr>
-        <w:t>值得先行對齊的，是這套設計所立足的理論座標。以下並非要向領域專家闡述理論，而是把本計畫設計所採用的理論操作化基礎明白列出，好方在把活動轉譯為</w:t>
+        <w:t>值得先行對齊的，是這套設計所立足的理論座標。以下並非要向領域專家闡述理論，而是把本計畫設計所採用的理論操作化基礎明白列出，好在把活動轉譯為</w:t>
       </w:r>
       <w:r>
         <w:rPr>
@@ -3329,7 +3329,7 @@
           <w:color w:val="1A1A1A"/>
           <w:lang w:eastAsia="zh-TW"/>
         </w:rPr>
-        <w:t>約束</w:t>
+        <w:t>約束鬆綁與組</w:t>
       </w:r>
       <w:r>
         <w:rPr>
@@ -3337,7 +3337,7 @@
           <w:lang w:eastAsia="zh-TW"/>
         </w:rPr>
         <w:lastRenderedPageBreak/>
-        <w:t>鬆綁與組塊拆解；這一點對本計畫尤其貼切，因為中文的「部件拆解」幾乎就是「組塊拆解」的字面實例，而「先忽略語義、把部件當作純粹的形狀」也正是「約束鬆綁」的具體展現（詳見第三章</w:t>
+        <w:t>塊拆解；這一點對本計畫尤其貼切，因為中文的「部件拆解」幾乎就是「組塊拆解」的字面實例，而「先忽略語義、把部件當作純粹的形狀」也正是「約束鬆綁」的具體展現（詳見第三章</w:t>
       </w:r>
       <w:r>
         <w:rPr>

</xml_diff>